<commit_message>
📄 DOCX firmado: BPE100708515 - 12/5/2026, 11:47:36 p.m.
</commit_message>
<xml_diff>
--- a/data/declaraciones/signed/BPE100708515.docx
+++ b/data/declaraciones/signed/BPE100708515.docx
@@ -4184,7 +4184,7 @@
         <w:rPr>
           <w:lang w:val="es-MX"/>
         </w:rPr>
-        <w:t xml:space="preserve">PROYECTOS TARGET MEDIA S DE RL DE CV</w:t>
+        <w:t xml:space="preserve">Proyectos Target Media, S de RL de CV</w:t>
       </w:r>
       <w:proofErr w:type="spellStart"/>
       <w:r>
@@ -4230,7 +4230,7 @@
         <w:rPr>
           <w:lang w:val="es-MX"/>
         </w:rPr>
-        <w:t xml:space="preserve">PROYECTOS TARGET MEDIA S DE RL DE CV</w:t>
+        <w:t xml:space="preserve">Juan Carlos Ramírez González</w:t>
       </w:r>
       <w:proofErr w:type="spellStart"/>
       <w:r>
@@ -4353,7 +4353,7 @@
         <w:rPr>
           <w:lang w:val="es-MX"/>
         </w:rPr>
-        <w:t xml:space="preserve">Fecha: 08 de abril de 2026</w:t>
+        <w:t xml:space="preserve">Fecha: 12 de mayo de 2026</w:t>
       </w:r>
       <w:proofErr w:type="spellStart"/>
       <w:r>

</xml_diff>